<commit_message>
Update website documentation: refine tab section and enhance user experience description; add references
</commit_message>
<xml_diff>
--- a/Documentation/WEDE5020 PoE Part 1 (SweetyPie).docx
+++ b/Documentation/WEDE5020 PoE Part 1 (SweetyPie).docx
@@ -1,6 +1,6 @@
 
 <file path=word/document.xml><?xml version="1.0" encoding="utf-8"?>
-<w:document xmlns:wpc="http://schemas.microsoft.com/office/word/2010/wordprocessingCanvas" xmlns:cx="http://schemas.microsoft.com/office/drawing/2014/chartex" xmlns:cx1="http://schemas.microsoft.com/office/drawing/2015/9/8/chartex" xmlns:cx2="http://schemas.microsoft.com/office/drawing/2015/10/21/chartex" xmlns:cx3="http://schemas.microsoft.com/office/drawing/2016/5/9/chartex" xmlns:cx4="http://schemas.microsoft.com/office/drawing/2016/5/10/chartex" xmlns:cx5="http://schemas.microsoft.com/office/drawing/2016/5/11/chartex" xmlns:cx6="http://schemas.microsoft.com/office/drawing/2016/5/12/chartex" xmlns:cx7="http://schemas.microsoft.com/office/drawing/2016/5/13/chartex" xmlns:cx8="http://schemas.microsoft.com/office/drawing/2016/5/14/chartex" xmlns:mc="http://schemas.openxmlformats.org/markup-compatibility/2006" xmlns:aink="http://schemas.microsoft.com/office/drawing/2016/ink" xmlns:am3d="http://schemas.microsoft.com/office/drawing/2017/model3d" xmlns:o="urn:schemas-microsoft-com:office:office" xmlns:oel="http://schemas.microsoft.com/office/2019/extlst" xmlns:r="http://schemas.openxmlformats.org/officeDocument/2006/relationships" xmlns:m="http://schemas.openxmlformats.org/officeDocument/2006/math" xmlns:v="urn:schemas-microsoft-com:vml" xmlns:wp14="http://schemas.microsoft.com/office/word/2010/wordprocessingDrawing" xmlns:wp="http://schemas.openxmlformats.org/drawingml/2006/wordprocessingDrawing" xmlns:w10="urn:schemas-microsoft-com:office:word" xmlns:w="http://schemas.openxmlformats.org/wordprocessingml/2006/main" xmlns:w14="http://schemas.microsoft.com/office/word/2010/wordml" xmlns:w15="http://schemas.microsoft.com/office/word/2012/wordml" xmlns:w16cei="http://schemas.microsoft.com/office/word/2026/wordml/cei" xmlns:w16cex="http://schemas.microsoft.com/office/word/2018/wordml/cex" xmlns:w16cid="http://schemas.microsoft.com/office/word/2016/wordml/cid" xmlns:w16="http://schemas.microsoft.com/office/word/2018/wordml" xmlns:w16du="http://schemas.microsoft.com/office/word/2023/wordml/word16du" xmlns:w16sdtdh="http://schemas.microsoft.com/office/word/2020/wordml/sdtdatahash" xmlns:w16sdtfl="http://schemas.microsoft.com/office/word/2024/wordml/sdtformatlock" xmlns:w16se="http://schemas.microsoft.com/office/word/2015/wordml/symex" xmlns:wpg="http://schemas.microsoft.com/office/word/2010/wordprocessingGroup" xmlns:wpi="http://schemas.microsoft.com/office/word/2010/wordprocessingInk" xmlns:wne="http://schemas.microsoft.com/office/word/2006/wordml" xmlns:wps="http://schemas.microsoft.com/office/word/2010/wordprocessingShape" mc:Ignorable="w14 w15 w16se w16cid w16 w16cex w16sdtdh w16sdtfl w16du wp14">
+<w:document xmlns:wpc="http://schemas.microsoft.com/office/word/2010/wordprocessingCanvas" xmlns:cx="http://schemas.microsoft.com/office/drawing/2014/chartex" xmlns:cx1="http://schemas.microsoft.com/office/drawing/2015/9/8/chartex" xmlns:cx2="http://schemas.microsoft.com/office/drawing/2015/10/21/chartex" xmlns:cx3="http://schemas.microsoft.com/office/drawing/2016/5/9/chartex" xmlns:cx4="http://schemas.microsoft.com/office/drawing/2016/5/10/chartex" xmlns:cx5="http://schemas.microsoft.com/office/drawing/2016/5/11/chartex" xmlns:cx6="http://schemas.microsoft.com/office/drawing/2016/5/12/chartex" xmlns:cx7="http://schemas.microsoft.com/office/drawing/2016/5/13/chartex" xmlns:cx8="http://schemas.microsoft.com/office/drawing/2016/5/14/chartex" xmlns:mc="http://schemas.openxmlformats.org/markup-compatibility/2006" xmlns:aink="http://schemas.microsoft.com/office/drawing/2016/ink" xmlns:am3d="http://schemas.microsoft.com/office/drawing/2017/model3d" xmlns:o="urn:schemas-microsoft-com:office:office" xmlns:oel="http://schemas.microsoft.com/office/2019/extlst" xmlns:r="http://schemas.openxmlformats.org/officeDocument/2006/relationships" xmlns:m="http://schemas.openxmlformats.org/officeDocument/2006/math" xmlns:v="urn:schemas-microsoft-com:vml" xmlns:wp14="http://schemas.microsoft.com/office/word/2010/wordprocessingDrawing" xmlns:wp="http://schemas.openxmlformats.org/drawingml/2006/wordprocessingDrawing" xmlns:w10="urn:schemas-microsoft-com:office:word" xmlns:w="http://schemas.openxmlformats.org/wordprocessingml/2006/main" xmlns:w14="http://schemas.microsoft.com/office/word/2010/wordml" xmlns:w15="http://schemas.microsoft.com/office/word/2012/wordml" xmlns:w16cex="http://schemas.microsoft.com/office/word/2018/wordml/cex" xmlns:w16cid="http://schemas.microsoft.com/office/word/2016/wordml/cid" xmlns:w16="http://schemas.microsoft.com/office/word/2018/wordml" xmlns:w16du="http://schemas.microsoft.com/office/word/2023/wordml/word16du" xmlns:w16sdtdh="http://schemas.microsoft.com/office/word/2020/wordml/sdtdatahash" xmlns:w16sdtfl="http://schemas.microsoft.com/office/word/2024/wordml/sdtformatlock" xmlns:w16se="http://schemas.microsoft.com/office/word/2015/wordml/symex" xmlns:wpg="http://schemas.microsoft.com/office/word/2010/wordprocessingGroup" xmlns:wpi="http://schemas.microsoft.com/office/word/2010/wordprocessingInk" xmlns:wne="http://schemas.microsoft.com/office/word/2006/wordml" xmlns:wps="http://schemas.microsoft.com/office/word/2010/wordprocessingShape" mc:Ignorable="w14 w15 w16se w16cid w16 w16cex w16sdtdh w16sdtfl w16du wp14">
   <w:body>
     <w:p>
       <w:pPr>
@@ -530,7 +530,25 @@
         <w:rPr>
           <w:lang w:val="en-GB"/>
         </w:rPr>
-        <w:t xml:space="preserve">, Our </w:t>
+        <w:t>,</w:t>
+      </w:r>
+      <w:r>
+        <w:rPr>
+          <w:lang w:val="en-GB"/>
+        </w:rPr>
+        <w:t xml:space="preserve"> Enquir</w:t>
+      </w:r>
+      <w:r>
+        <w:rPr>
+          <w:lang w:val="en-GB"/>
+        </w:rPr>
+        <w:t>ies, and</w:t>
+      </w:r>
+      <w:r>
+        <w:rPr>
+          <w:lang w:val="en-GB"/>
+        </w:rPr>
+        <w:t xml:space="preserve"> Our </w:t>
       </w:r>
       <w:r>
         <w:rPr>
@@ -953,7 +971,19 @@
         <w:rPr>
           <w:lang w:val="en-GB"/>
         </w:rPr>
-        <w:t xml:space="preserve">About Us, Contact Us, and Our Services. </w:t>
+        <w:t>About Us, Contact Us,</w:t>
+      </w:r>
+      <w:r>
+        <w:rPr>
+          <w:lang w:val="en-GB"/>
+        </w:rPr>
+        <w:t xml:space="preserve"> Enquiries,</w:t>
+      </w:r>
+      <w:r>
+        <w:rPr>
+          <w:lang w:val="en-GB"/>
+        </w:rPr>
+        <w:t xml:space="preserve"> and Our Services. </w:t>
       </w:r>
       <w:r>
         <w:rPr>
@@ -1027,19 +1057,18 @@
         <w:rPr>
           <w:lang w:val="en-GB"/>
         </w:rPr>
-        <w:t xml:space="preserve"> When a user clicks on a product, it will be added to the query box on the </w:t>
-      </w:r>
-      <w:r>
-        <w:rPr>
-          <w:lang w:val="en-GB"/>
-        </w:rPr>
-        <w:t xml:space="preserve">Contact us </w:t>
-      </w:r>
-      <w:r>
-        <w:rPr>
-          <w:lang w:val="en-GB"/>
-        </w:rPr>
-        <w:lastRenderedPageBreak/>
+        <w:t xml:space="preserve"> </w:t>
+      </w:r>
+      <w:r>
+        <w:rPr>
+          <w:lang w:val="en-GB"/>
+        </w:rPr>
+        <w:t xml:space="preserve">There will be a forum </w:t>
+      </w:r>
+      <w:r>
+        <w:rPr>
+          <w:lang w:val="en-GB"/>
+        </w:rPr>
         <w:t>page, where they can insert their email and personal info</w:t>
       </w:r>
       <w:r>
@@ -1058,7 +1087,25 @@
         <w:rPr>
           <w:lang w:val="en-GB"/>
         </w:rPr>
-        <w:t xml:space="preserve"> it will send an email to the bakery.</w:t>
+        <w:t>,</w:t>
+      </w:r>
+      <w:r>
+        <w:rPr>
+          <w:lang w:val="en-GB"/>
+        </w:rPr>
+        <w:t xml:space="preserve"> it will send </w:t>
+      </w:r>
+      <w:r>
+        <w:rPr>
+          <w:lang w:val="en-GB"/>
+        </w:rPr>
+        <w:t xml:space="preserve">it </w:t>
+      </w:r>
+      <w:r>
+        <w:rPr>
+          <w:lang w:val="en-GB"/>
+        </w:rPr>
+        <w:t>to the bakery.</w:t>
       </w:r>
     </w:p>
     <w:p>
@@ -1324,26 +1371,26 @@
           <w:bCs/>
           <w:lang w:val="en-GB"/>
         </w:rPr>
+        <w:t xml:space="preserve">Contact Us: </w:t>
+      </w:r>
+    </w:p>
+    <w:p>
+      <w:pPr>
+        <w:pStyle w:val="ListParagraph"/>
+        <w:rPr>
+          <w:b/>
+          <w:bCs/>
+          <w:lang w:val="en-GB"/>
+        </w:rPr>
+      </w:pPr>
+      <w:r>
+        <w:rPr>
+          <w:b/>
+          <w:bCs/>
+          <w:noProof/>
+          <w:lang w:val="en-GB"/>
+        </w:rPr>
         <w:lastRenderedPageBreak/>
-        <w:t xml:space="preserve">Contact Us: </w:t>
-      </w:r>
-    </w:p>
-    <w:p>
-      <w:pPr>
-        <w:pStyle w:val="ListParagraph"/>
-        <w:rPr>
-          <w:b/>
-          <w:bCs/>
-          <w:lang w:val="en-GB"/>
-        </w:rPr>
-      </w:pPr>
-      <w:r>
-        <w:rPr>
-          <w:b/>
-          <w:bCs/>
-          <w:noProof/>
-          <w:lang w:val="en-GB"/>
-        </w:rPr>
         <w:drawing>
           <wp:inline distT="0" distB="0" distL="0" distR="0" wp14:anchorId="056F27A6" wp14:editId="3BFD94C7">
             <wp:extent cx="4777740" cy="4060497"/>
@@ -1841,92 +1888,24 @@
         </w:rPr>
       </w:pPr>
       <w:r>
-        <w:t xml:space="preserve">Le Cordon Bleu, 2018. What are pâtisserie, boulangerie and </w:t>
-      </w:r>
-      <w:proofErr w:type="spellStart"/>
-      <w:r>
-        <w:t>viennoiserie</w:t>
-      </w:r>
-      <w:proofErr w:type="spellEnd"/>
-      <w:r>
-        <w:t xml:space="preserve">? Le Cordon Bleu, </w:t>
-      </w:r>
-      <w:r>
-        <w:t>25 September</w:t>
-      </w:r>
-      <w:r>
-        <w:t xml:space="preserve">. Available at: </w:t>
-      </w:r>
-      <w:hyperlink r:id="rId13" w:history="1">
-        <w:r>
-          <w:rPr>
-            <w:rStyle w:val="Hyperlink"/>
-          </w:rPr>
-          <w:t>https://www.cordonbleu.edu/news/what-are-patisserie-boulangerie-viennoiserie/en</w:t>
-        </w:r>
-      </w:hyperlink>
-      <w:r>
-        <w:t xml:space="preserve">  </w:t>
-      </w:r>
-      <w:r>
-        <w:t xml:space="preserve">[Accessed </w:t>
-      </w:r>
-      <w:r>
-        <w:t>3</w:t>
-      </w:r>
-      <w:r>
-        <w:t xml:space="preserve"> August 2026].</w:t>
-      </w:r>
-      <w:r>
+        <w:rPr>
+          <w:lang w:val="en-GB"/>
+        </w:rPr>
+        <w:t>Adobe, n.d. The different styles of typography. Adobe Creative Cloud. Available at:</w:t>
+      </w:r>
+      <w:r>
+        <w:rPr>
+          <w:lang w:val="en-GB"/>
+        </w:rPr>
         <w:t xml:space="preserve"> </w:t>
       </w:r>
-    </w:p>
-    <w:p>
-      <w:pPr>
-        <w:pStyle w:val="ListParagraph"/>
-        <w:numPr>
-          <w:ilvl w:val="0"/>
-          <w:numId w:val="2"/>
-        </w:numPr>
-        <w:rPr>
-          <w:lang w:val="en-GB"/>
-        </w:rPr>
-      </w:pPr>
-      <w:proofErr w:type="spellStart"/>
-      <w:r>
-        <w:rPr>
-          <w:lang w:val="en-GB"/>
-        </w:rPr>
-        <w:t>Zeely</w:t>
-      </w:r>
-      <w:proofErr w:type="spellEnd"/>
-      <w:r>
-        <w:rPr>
-          <w:lang w:val="en-GB"/>
-        </w:rPr>
-        <w:t xml:space="preserve"> AI, 2025. Proven bakery marketing ideas and strategies you can use in 2026. </w:t>
-      </w:r>
-      <w:proofErr w:type="spellStart"/>
-      <w:r>
-        <w:rPr>
-          <w:lang w:val="en-GB"/>
-        </w:rPr>
-        <w:t>Zeely</w:t>
-      </w:r>
-      <w:proofErr w:type="spellEnd"/>
-      <w:r>
-        <w:rPr>
-          <w:lang w:val="en-GB"/>
-        </w:rPr>
-        <w:t xml:space="preserve"> AI, 24 September. Available at: </w:t>
-      </w:r>
-      <w:hyperlink r:id="rId14" w:history="1">
+      <w:hyperlink r:id="rId13" w:anchor="the-different-styles-of-typography" w:history="1">
         <w:r>
           <w:rPr>
             <w:rStyle w:val="Hyperlink"/>
             <w:lang w:val="en-GB"/>
           </w:rPr>
-          <w:t>https://zeely.ai/blog/proven-bakery-marketing-ideas-and-strategies/</w:t>
+          <w:t>https://www.adobe.com/za/creativecloud/design/discover/typography.html#the-different-styles-of-typography</w:t>
         </w:r>
       </w:hyperlink>
       <w:r>
@@ -1959,7 +1938,7 @@
         </w:rPr>
         <w:t xml:space="preserve">Adeyemicovenant3, n.d. Key Performance Indicators for Bakeries [CMS Project]. Scribd. Available at: </w:t>
       </w:r>
-      <w:hyperlink r:id="rId15" w:history="1">
+      <w:hyperlink r:id="rId14" w:history="1">
         <w:r>
           <w:rPr>
             <w:rStyle w:val="Hyperlink"/>
@@ -2004,25 +1983,186 @@
           <w:lang w:val="en-GB"/>
         </w:rPr>
       </w:pPr>
-      <w:r>
-        <w:rPr>
-          <w:lang w:val="en-GB"/>
-        </w:rPr>
-        <w:t>Adobe, n.d. The different styles of typography. Adobe Creative Cloud. Available at:</w:t>
-      </w:r>
-      <w:r>
-        <w:rPr>
-          <w:lang w:val="en-GB"/>
-        </w:rPr>
-        <w:t xml:space="preserve"> </w:t>
-      </w:r>
-      <w:hyperlink r:id="rId16" w:anchor="the-different-styles-of-typography" w:history="1">
+      <w:proofErr w:type="spellStart"/>
+      <w:r>
+        <w:rPr>
+          <w:lang w:val="en-GB"/>
+        </w:rPr>
+        <w:t>Coolors</w:t>
+      </w:r>
+      <w:proofErr w:type="spellEnd"/>
+      <w:r>
+        <w:rPr>
+          <w:lang w:val="en-GB"/>
+        </w:rPr>
+        <w:t xml:space="preserve">, 2026. </w:t>
+      </w:r>
+      <w:proofErr w:type="spellStart"/>
+      <w:r>
+        <w:rPr>
+          <w:lang w:val="en-GB"/>
+        </w:rPr>
+        <w:t>Color</w:t>
+      </w:r>
+      <w:proofErr w:type="spellEnd"/>
+      <w:r>
+        <w:rPr>
+          <w:lang w:val="en-GB"/>
+        </w:rPr>
+        <w:t xml:space="preserve"> palette (Bakery Website): #880D1E, #DD2D4A, #F26A8D, #F49CBB, #CBEEF3. [image online] Available at: </w:t>
+      </w:r>
+      <w:hyperlink r:id="rId15" w:history="1">
         <w:r>
           <w:rPr>
             <w:rStyle w:val="Hyperlink"/>
             <w:lang w:val="en-GB"/>
           </w:rPr>
-          <w:t>https://www.adobe.com/za/creativecloud/design/discover/typography.html#the-different-styles-of-typography</w:t>
+          <w:t>https://coolors.co/880d1e-dd2d4a-f26a8d-f49cbb-cbeef3</w:t>
+        </w:r>
+      </w:hyperlink>
+      <w:r>
+        <w:rPr>
+          <w:lang w:val="en-GB"/>
+        </w:rPr>
+        <w:t xml:space="preserve">  </w:t>
+      </w:r>
+      <w:proofErr w:type="gramStart"/>
+      <w:r>
+        <w:rPr>
+          <w:lang w:val="en-GB"/>
+        </w:rPr>
+        <w:t xml:space="preserve"> </w:t>
+      </w:r>
+      <w:r>
+        <w:rPr>
+          <w:lang w:val="en-GB"/>
+        </w:rPr>
+        <w:t xml:space="preserve"> </w:t>
+      </w:r>
+      <w:r>
+        <w:rPr>
+          <w:lang w:val="en-GB"/>
+        </w:rPr>
+        <w:t xml:space="preserve"> </w:t>
+      </w:r>
+      <w:r>
+        <w:rPr>
+          <w:lang w:val="en-GB"/>
+        </w:rPr>
+        <w:t>[</w:t>
+      </w:r>
+      <w:proofErr w:type="gramEnd"/>
+      <w:r>
+        <w:rPr>
+          <w:lang w:val="en-GB"/>
+        </w:rPr>
+        <w:t>Accessed 1 September 2026].</w:t>
+      </w:r>
+      <w:r>
+        <w:rPr>
+          <w:lang w:val="en-GB"/>
+        </w:rPr>
+        <w:t xml:space="preserve"> </w:t>
+      </w:r>
+    </w:p>
+    <w:p>
+      <w:pPr>
+        <w:pStyle w:val="ListParagraph"/>
+        <w:numPr>
+          <w:ilvl w:val="0"/>
+          <w:numId w:val="2"/>
+        </w:numPr>
+        <w:rPr>
+          <w:lang w:val="en-GB"/>
+        </w:rPr>
+      </w:pPr>
+      <w:r>
+        <w:t xml:space="preserve">Le Cordon Bleu, 2018. What are pâtisserie, boulangerie and </w:t>
+      </w:r>
+      <w:proofErr w:type="spellStart"/>
+      <w:r>
+        <w:t>viennoiserie</w:t>
+      </w:r>
+      <w:proofErr w:type="spellEnd"/>
+      <w:r>
+        <w:t xml:space="preserve">? Le Cordon Bleu, </w:t>
+      </w:r>
+      <w:r>
+        <w:t>25 September</w:t>
+      </w:r>
+      <w:r>
+        <w:t xml:space="preserve">. Available at: </w:t>
+      </w:r>
+      <w:hyperlink r:id="rId16" w:history="1">
+        <w:r>
+          <w:rPr>
+            <w:rStyle w:val="Hyperlink"/>
+          </w:rPr>
+          <w:t>https://www.cordonbleu.edu/news/what-are-patisserie-boulangerie-viennoiserie/en</w:t>
+        </w:r>
+      </w:hyperlink>
+      <w:r>
+        <w:t xml:space="preserve">  </w:t>
+      </w:r>
+      <w:r>
+        <w:t xml:space="preserve">[Accessed </w:t>
+      </w:r>
+      <w:r>
+        <w:t>3</w:t>
+      </w:r>
+      <w:r>
+        <w:t xml:space="preserve"> August 2026].</w:t>
+      </w:r>
+      <w:r>
+        <w:t xml:space="preserve"> </w:t>
+      </w:r>
+    </w:p>
+    <w:p>
+      <w:pPr>
+        <w:pStyle w:val="ListParagraph"/>
+        <w:numPr>
+          <w:ilvl w:val="0"/>
+          <w:numId w:val="2"/>
+        </w:numPr>
+        <w:rPr>
+          <w:lang w:val="en-GB"/>
+        </w:rPr>
+      </w:pPr>
+      <w:proofErr w:type="spellStart"/>
+      <w:r>
+        <w:rPr>
+          <w:lang w:val="en-GB"/>
+        </w:rPr>
+        <w:t>Zeely</w:t>
+      </w:r>
+      <w:proofErr w:type="spellEnd"/>
+      <w:r>
+        <w:rPr>
+          <w:lang w:val="en-GB"/>
+        </w:rPr>
+        <w:t xml:space="preserve"> AI, 2025. Proven bakery marketing ideas and strategies you can use in 2026. </w:t>
+      </w:r>
+      <w:proofErr w:type="spellStart"/>
+      <w:r>
+        <w:rPr>
+          <w:lang w:val="en-GB"/>
+        </w:rPr>
+        <w:t>Zeely</w:t>
+      </w:r>
+      <w:proofErr w:type="spellEnd"/>
+      <w:r>
+        <w:rPr>
+          <w:lang w:val="en-GB"/>
+        </w:rPr>
+        <w:t xml:space="preserve"> AI, 24 September. Available at: </w:t>
+      </w:r>
+      <w:hyperlink r:id="rId17" w:history="1">
+        <w:r>
+          <w:rPr>
+            <w:rStyle w:val="Hyperlink"/>
+            <w:lang w:val="en-GB"/>
+          </w:rPr>
+          <w:t>https://zeely.ai/blog/proven-bakery-marketing-ideas-and-strategies/</w:t>
         </w:r>
       </w:hyperlink>
       <w:r>
@@ -2049,7 +2189,7 @@
 </file>
 
 <file path=word/numbering.xml><?xml version="1.0" encoding="utf-8"?>
-<w:numbering xmlns:wpc="http://schemas.microsoft.com/office/word/2010/wordprocessingCanvas" xmlns:cx="http://schemas.microsoft.com/office/drawing/2014/chartex" xmlns:cx1="http://schemas.microsoft.com/office/drawing/2015/9/8/chartex" xmlns:cx2="http://schemas.microsoft.com/office/drawing/2015/10/21/chartex" xmlns:cx3="http://schemas.microsoft.com/office/drawing/2016/5/9/chartex" xmlns:cx4="http://schemas.microsoft.com/office/drawing/2016/5/10/chartex" xmlns:cx5="http://schemas.microsoft.com/office/drawing/2016/5/11/chartex" xmlns:cx6="http://schemas.microsoft.com/office/drawing/2016/5/12/chartex" xmlns:cx7="http://schemas.microsoft.com/office/drawing/2016/5/13/chartex" xmlns:cx8="http://schemas.microsoft.com/office/drawing/2016/5/14/chartex" xmlns:mc="http://schemas.openxmlformats.org/markup-compatibility/2006" xmlns:aink="http://schemas.microsoft.com/office/drawing/2016/ink" xmlns:am3d="http://schemas.microsoft.com/office/drawing/2017/model3d" xmlns:o="urn:schemas-microsoft-com:office:office" xmlns:oel="http://schemas.microsoft.com/office/2019/extlst" xmlns:r="http://schemas.openxmlformats.org/officeDocument/2006/relationships" xmlns:m="http://schemas.openxmlformats.org/officeDocument/2006/math" xmlns:v="urn:schemas-microsoft-com:vml" xmlns:wp14="http://schemas.microsoft.com/office/word/2010/wordprocessingDrawing" xmlns:wp="http://schemas.openxmlformats.org/drawingml/2006/wordprocessingDrawing" xmlns:w10="urn:schemas-microsoft-com:office:word" xmlns:w="http://schemas.openxmlformats.org/wordprocessingml/2006/main" xmlns:w14="http://schemas.microsoft.com/office/word/2010/wordml" xmlns:w15="http://schemas.microsoft.com/office/word/2012/wordml" xmlns:w16cei="http://schemas.microsoft.com/office/word/2026/wordml/cei" xmlns:w16cex="http://schemas.microsoft.com/office/word/2018/wordml/cex" xmlns:w16cid="http://schemas.microsoft.com/office/word/2016/wordml/cid" xmlns:w16="http://schemas.microsoft.com/office/word/2018/wordml" xmlns:w16du="http://schemas.microsoft.com/office/word/2023/wordml/word16du" xmlns:w16sdtdh="http://schemas.microsoft.com/office/word/2020/wordml/sdtdatahash" xmlns:w16sdtfl="http://schemas.microsoft.com/office/word/2024/wordml/sdtformatlock" xmlns:w16se="http://schemas.microsoft.com/office/word/2015/wordml/symex" xmlns:wpg="http://schemas.microsoft.com/office/word/2010/wordprocessingGroup" xmlns:wpi="http://schemas.microsoft.com/office/word/2010/wordprocessingInk" xmlns:wne="http://schemas.microsoft.com/office/word/2006/wordml" xmlns:wps="http://schemas.microsoft.com/office/word/2010/wordprocessingShape" mc:Ignorable="w14 w15 w16se w16cid w16 w16cex w16sdtdh w16sdtfl w16du wp14">
+<w:numbering xmlns:wpc="http://schemas.microsoft.com/office/word/2010/wordprocessingCanvas" xmlns:cx="http://schemas.microsoft.com/office/drawing/2014/chartex" xmlns:cx1="http://schemas.microsoft.com/office/drawing/2015/9/8/chartex" xmlns:cx2="http://schemas.microsoft.com/office/drawing/2015/10/21/chartex" xmlns:cx3="http://schemas.microsoft.com/office/drawing/2016/5/9/chartex" xmlns:cx4="http://schemas.microsoft.com/office/drawing/2016/5/10/chartex" xmlns:cx5="http://schemas.microsoft.com/office/drawing/2016/5/11/chartex" xmlns:cx6="http://schemas.microsoft.com/office/drawing/2016/5/12/chartex" xmlns:cx7="http://schemas.microsoft.com/office/drawing/2016/5/13/chartex" xmlns:cx8="http://schemas.microsoft.com/office/drawing/2016/5/14/chartex" xmlns:mc="http://schemas.openxmlformats.org/markup-compatibility/2006" xmlns:aink="http://schemas.microsoft.com/office/drawing/2016/ink" xmlns:am3d="http://schemas.microsoft.com/office/drawing/2017/model3d" xmlns:o="urn:schemas-microsoft-com:office:office" xmlns:oel="http://schemas.microsoft.com/office/2019/extlst" xmlns:r="http://schemas.openxmlformats.org/officeDocument/2006/relationships" xmlns:m="http://schemas.openxmlformats.org/officeDocument/2006/math" xmlns:v="urn:schemas-microsoft-com:vml" xmlns:wp14="http://schemas.microsoft.com/office/word/2010/wordprocessingDrawing" xmlns:wp="http://schemas.openxmlformats.org/drawingml/2006/wordprocessingDrawing" xmlns:w10="urn:schemas-microsoft-com:office:word" xmlns:w="http://schemas.openxmlformats.org/wordprocessingml/2006/main" xmlns:w14="http://schemas.microsoft.com/office/word/2010/wordml" xmlns:w15="http://schemas.microsoft.com/office/word/2012/wordml" xmlns:w16cex="http://schemas.microsoft.com/office/word/2018/wordml/cex" xmlns:w16cid="http://schemas.microsoft.com/office/word/2016/wordml/cid" xmlns:w16="http://schemas.microsoft.com/office/word/2018/wordml" xmlns:w16du="http://schemas.microsoft.com/office/word/2023/wordml/word16du" xmlns:w16sdtdh="http://schemas.microsoft.com/office/word/2020/wordml/sdtdatahash" xmlns:w16sdtfl="http://schemas.microsoft.com/office/word/2024/wordml/sdtformatlock" xmlns:w16se="http://schemas.microsoft.com/office/word/2015/wordml/symex" xmlns:wpg="http://schemas.microsoft.com/office/word/2010/wordprocessingGroup" xmlns:wpi="http://schemas.microsoft.com/office/word/2010/wordprocessingInk" xmlns:wne="http://schemas.microsoft.com/office/word/2006/wordml" xmlns:wps="http://schemas.microsoft.com/office/word/2010/wordprocessingShape" mc:Ignorable="w14 w15 w16se w16cid w16 w16cex w16sdtdh w16sdtfl w16du wp14">
   <w:abstractNum w:abstractNumId="0" w15:restartNumberingAfterBreak="0">
     <w:nsid w:val="044B6C60"/>
     <w:multiLevelType w:val="hybridMultilevel"/>
@@ -3592,6 +3732,18 @@
       <w:shd w:val="clear" w:color="auto" w:fill="E1DFDD"/>
     </w:rPr>
   </w:style>
+  <w:style w:type="character" w:styleId="FollowedHyperlink">
+    <w:name w:val="FollowedHyperlink"/>
+    <w:basedOn w:val="DefaultParagraphFont"/>
+    <w:uiPriority w:val="99"/>
+    <w:semiHidden/>
+    <w:unhideWhenUsed/>
+    <w:rsid w:val="00AF5215"/>
+    <w:rPr>
+      <w:color w:val="96607D" w:themeColor="followedHyperlink"/>
+      <w:u w:val="single"/>
+    </w:rPr>
+  </w:style>
 </w:styles>
 </file>
 

</xml_diff>

<commit_message>
Add MDN Web Docs references and enhance image descriptions across multiple HTML files
</commit_message>
<xml_diff>
--- a/Documentation/WEDE5020 PoE Part 1 (SweetyPie).docx
+++ b/Documentation/WEDE5020 PoE Part 1 (SweetyPie).docx
@@ -842,6 +842,48 @@
           <w:lang w:val="en-GB"/>
         </w:rPr>
       </w:pPr>
+      <w:r>
+        <w:rPr>
+          <w:b/>
+          <w:bCs/>
+          <w:lang w:val="en-GB"/>
+        </w:rPr>
+        <w:t>Figure 1</w:t>
+      </w:r>
+      <w:r>
+        <w:rPr>
+          <w:b/>
+          <w:bCs/>
+          <w:lang w:val="en-GB"/>
+        </w:rPr>
+        <w:t xml:space="preserve">, </w:t>
+      </w:r>
+      <w:proofErr w:type="spellStart"/>
+      <w:r>
+        <w:rPr>
+          <w:b/>
+          <w:bCs/>
+        </w:rPr>
+        <w:t>Coolors</w:t>
+      </w:r>
+      <w:proofErr w:type="spellEnd"/>
+      <w:r>
+        <w:rPr>
+          <w:b/>
+          <w:bCs/>
+        </w:rPr>
+        <w:t>, 2026.</w:t>
+      </w:r>
+    </w:p>
+    <w:p>
+      <w:pPr>
+        <w:pStyle w:val="ListParagraph"/>
+        <w:rPr>
+          <w:b/>
+          <w:bCs/>
+          <w:lang w:val="en-GB"/>
+        </w:rPr>
+      </w:pPr>
     </w:p>
     <w:p>
       <w:pPr>
@@ -1063,7 +1105,14 @@
         <w:rPr>
           <w:lang w:val="en-GB"/>
         </w:rPr>
-        <w:t xml:space="preserve">There will be a forum </w:t>
+        <w:t xml:space="preserve">There </w:t>
+      </w:r>
+      <w:r>
+        <w:rPr>
+          <w:lang w:val="en-GB"/>
+        </w:rPr>
+        <w:lastRenderedPageBreak/>
+        <w:t xml:space="preserve">will be a forum </w:t>
       </w:r>
       <w:r>
         <w:rPr>
@@ -1371,6 +1420,7 @@
           <w:bCs/>
           <w:lang w:val="en-GB"/>
         </w:rPr>
+        <w:lastRenderedPageBreak/>
         <w:t xml:space="preserve">Contact Us: </w:t>
       </w:r>
     </w:p>
@@ -1390,7 +1440,6 @@
           <w:noProof/>
           <w:lang w:val="en-GB"/>
         </w:rPr>
-        <w:lastRenderedPageBreak/>
         <w:drawing>
           <wp:inline distT="0" distB="0" distL="0" distR="0" wp14:anchorId="056F27A6" wp14:editId="3BFD94C7">
             <wp:extent cx="4777740" cy="4060497"/>
@@ -1453,6 +1502,264 @@
           <w:lang w:val="en-GB"/>
         </w:rPr>
       </w:pPr>
+    </w:p>
+    <w:p>
+      <w:pPr>
+        <w:pStyle w:val="ListParagraph"/>
+        <w:rPr>
+          <w:b/>
+          <w:bCs/>
+          <w:lang w:val="en-GB"/>
+        </w:rPr>
+      </w:pPr>
+      <w:r>
+        <w:rPr>
+          <w:b/>
+          <w:bCs/>
+          <w:lang w:val="en-GB"/>
+        </w:rPr>
+        <w:t>Enquiries:</w:t>
+      </w:r>
+    </w:p>
+    <w:p>
+      <w:pPr>
+        <w:pStyle w:val="ListParagraph"/>
+        <w:rPr>
+          <w:b/>
+          <w:bCs/>
+          <w:lang w:val="en-GB"/>
+        </w:rPr>
+      </w:pPr>
+      <w:r>
+        <w:rPr>
+          <w:noProof/>
+        </w:rPr>
+        <w:drawing>
+          <wp:inline distT="0" distB="0" distL="0" distR="0" wp14:anchorId="5712DF35" wp14:editId="1AF1EA9D">
+            <wp:extent cx="5731510" cy="3223895"/>
+            <wp:effectExtent l="0" t="0" r="2540" b="0"/>
+            <wp:docPr id="1057815557" name="Picture 1"/>
+            <wp:cNvGraphicFramePr>
+              <a:graphicFrameLocks xmlns:a="http://schemas.openxmlformats.org/drawingml/2006/main" noChangeAspect="1"/>
+            </wp:cNvGraphicFramePr>
+            <a:graphic xmlns:a="http://schemas.openxmlformats.org/drawingml/2006/main">
+              <a:graphicData uri="http://schemas.openxmlformats.org/drawingml/2006/picture">
+                <pic:pic xmlns:pic="http://schemas.openxmlformats.org/drawingml/2006/picture">
+                  <pic:nvPicPr>
+                    <pic:cNvPr id="1057815557" name=""/>
+                    <pic:cNvPicPr/>
+                  </pic:nvPicPr>
+                  <pic:blipFill>
+                    <a:blip r:embed="rId9"/>
+                    <a:stretch>
+                      <a:fillRect/>
+                    </a:stretch>
+                  </pic:blipFill>
+                  <pic:spPr>
+                    <a:xfrm>
+                      <a:off x="0" y="0"/>
+                      <a:ext cx="5731510" cy="3223895"/>
+                    </a:xfrm>
+                    <a:prstGeom prst="rect">
+                      <a:avLst/>
+                    </a:prstGeom>
+                  </pic:spPr>
+                </pic:pic>
+              </a:graphicData>
+            </a:graphic>
+          </wp:inline>
+        </w:drawing>
+      </w:r>
+    </w:p>
+    <w:p>
+      <w:pPr>
+        <w:pStyle w:val="ListParagraph"/>
+        <w:rPr>
+          <w:b/>
+          <w:bCs/>
+          <w:lang w:val="en-GB"/>
+        </w:rPr>
+      </w:pPr>
+    </w:p>
+    <w:p>
+      <w:pPr>
+        <w:pStyle w:val="ListParagraph"/>
+        <w:rPr>
+          <w:b/>
+          <w:bCs/>
+          <w:lang w:val="en-GB"/>
+        </w:rPr>
+      </w:pPr>
+    </w:p>
+    <w:p>
+      <w:pPr>
+        <w:pStyle w:val="ListParagraph"/>
+        <w:rPr>
+          <w:b/>
+          <w:bCs/>
+          <w:lang w:val="en-GB"/>
+        </w:rPr>
+      </w:pPr>
+    </w:p>
+    <w:p>
+      <w:pPr>
+        <w:pStyle w:val="ListParagraph"/>
+        <w:rPr>
+          <w:b/>
+          <w:bCs/>
+          <w:lang w:val="en-GB"/>
+        </w:rPr>
+      </w:pPr>
+    </w:p>
+    <w:p>
+      <w:pPr>
+        <w:pStyle w:val="ListParagraph"/>
+        <w:rPr>
+          <w:b/>
+          <w:bCs/>
+          <w:lang w:val="en-GB"/>
+        </w:rPr>
+      </w:pPr>
+    </w:p>
+    <w:p>
+      <w:pPr>
+        <w:pStyle w:val="ListParagraph"/>
+        <w:rPr>
+          <w:b/>
+          <w:bCs/>
+          <w:lang w:val="en-GB"/>
+        </w:rPr>
+      </w:pPr>
+    </w:p>
+    <w:p>
+      <w:pPr>
+        <w:pStyle w:val="ListParagraph"/>
+        <w:rPr>
+          <w:b/>
+          <w:bCs/>
+          <w:lang w:val="en-GB"/>
+        </w:rPr>
+      </w:pPr>
+    </w:p>
+    <w:p>
+      <w:pPr>
+        <w:pStyle w:val="ListParagraph"/>
+        <w:rPr>
+          <w:b/>
+          <w:bCs/>
+          <w:lang w:val="en-GB"/>
+        </w:rPr>
+      </w:pPr>
+    </w:p>
+    <w:p>
+      <w:pPr>
+        <w:pStyle w:val="ListParagraph"/>
+        <w:rPr>
+          <w:b/>
+          <w:bCs/>
+          <w:lang w:val="en-GB"/>
+        </w:rPr>
+      </w:pPr>
+    </w:p>
+    <w:p>
+      <w:pPr>
+        <w:pStyle w:val="ListParagraph"/>
+        <w:rPr>
+          <w:b/>
+          <w:bCs/>
+          <w:lang w:val="en-GB"/>
+        </w:rPr>
+      </w:pPr>
+    </w:p>
+    <w:p>
+      <w:pPr>
+        <w:pStyle w:val="ListParagraph"/>
+        <w:rPr>
+          <w:b/>
+          <w:bCs/>
+          <w:lang w:val="en-GB"/>
+        </w:rPr>
+      </w:pPr>
+    </w:p>
+    <w:p>
+      <w:pPr>
+        <w:pStyle w:val="ListParagraph"/>
+        <w:rPr>
+          <w:b/>
+          <w:bCs/>
+          <w:lang w:val="en-GB"/>
+        </w:rPr>
+      </w:pPr>
+    </w:p>
+    <w:p>
+      <w:pPr>
+        <w:pStyle w:val="ListParagraph"/>
+        <w:rPr>
+          <w:b/>
+          <w:bCs/>
+          <w:lang w:val="en-GB"/>
+        </w:rPr>
+      </w:pPr>
+    </w:p>
+    <w:p>
+      <w:pPr>
+        <w:pStyle w:val="ListParagraph"/>
+        <w:rPr>
+          <w:b/>
+          <w:bCs/>
+          <w:lang w:val="en-GB"/>
+        </w:rPr>
+      </w:pPr>
+    </w:p>
+    <w:p>
+      <w:pPr>
+        <w:pStyle w:val="ListParagraph"/>
+        <w:rPr>
+          <w:b/>
+          <w:bCs/>
+          <w:lang w:val="en-GB"/>
+        </w:rPr>
+      </w:pPr>
+    </w:p>
+    <w:p>
+      <w:pPr>
+        <w:pStyle w:val="ListParagraph"/>
+        <w:rPr>
+          <w:b/>
+          <w:bCs/>
+          <w:lang w:val="en-GB"/>
+        </w:rPr>
+      </w:pPr>
+    </w:p>
+    <w:p>
+      <w:pPr>
+        <w:pStyle w:val="ListParagraph"/>
+        <w:rPr>
+          <w:b/>
+          <w:bCs/>
+          <w:lang w:val="en-GB"/>
+        </w:rPr>
+      </w:pPr>
+    </w:p>
+    <w:p>
+      <w:pPr>
+        <w:pStyle w:val="ListParagraph"/>
+        <w:rPr>
+          <w:b/>
+          <w:bCs/>
+          <w:lang w:val="en-GB"/>
+        </w:rPr>
+      </w:pPr>
+    </w:p>
+    <w:p>
+      <w:pPr>
+        <w:pStyle w:val="ListParagraph"/>
+        <w:rPr>
+          <w:b/>
+          <w:bCs/>
+          <w:lang w:val="en-GB"/>
+        </w:rPr>
+      </w:pPr>
       <w:r>
         <w:rPr>
           <w:b/>
@@ -1494,7 +1801,7 @@
                     <pic:cNvPicPr/>
                   </pic:nvPicPr>
                   <pic:blipFill>
-                    <a:blip r:embed="rId9">
+                    <a:blip r:embed="rId10">
                       <a:extLst>
                         <a:ext uri="{28A0092B-C50C-407E-A947-70E740481C1C}">
                           <a14:useLocalDpi xmlns:a14="http://schemas.microsoft.com/office/drawing/2010/main" val="0"/>
@@ -1540,7 +1847,6 @@
         <w:rPr>
           <w:lang w:val="en-GB"/>
         </w:rPr>
-        <w:lastRenderedPageBreak/>
         <w:t>Technical Requirements:</w:t>
       </w:r>
     </w:p>
@@ -1590,7 +1896,7 @@
         </w:rPr>
         <w:t xml:space="preserve"> Link: </w:t>
       </w:r>
-      <w:hyperlink r:id="rId10" w:history="1">
+      <w:hyperlink r:id="rId11" w:history="1">
         <w:r>
           <w:rPr>
             <w:rStyle w:val="Hyperlink"/>
@@ -1626,7 +1932,7 @@
         </w:rPr>
         <w:t xml:space="preserve"> – </w:t>
       </w:r>
-      <w:hyperlink r:id="rId11" w:history="1">
+      <w:hyperlink r:id="rId12" w:history="1">
         <w:r>
           <w:rPr>
             <w:rStyle w:val="Hyperlink"/>
@@ -1647,7 +1953,7 @@
         </w:rPr>
         <w:t xml:space="preserve">Link: </w:t>
       </w:r>
-      <w:hyperlink r:id="rId12" w:history="1">
+      <w:hyperlink r:id="rId13" w:history="1">
         <w:r>
           <w:rPr>
             <w:rStyle w:val="Hyperlink"/>
@@ -1681,6 +1987,7 @@
           <w:bCs/>
           <w:lang w:val="en-GB"/>
         </w:rPr>
+        <w:lastRenderedPageBreak/>
         <w:t>Programming language</w:t>
       </w:r>
       <w:r>
@@ -1899,7 +2206,7 @@
         </w:rPr>
         <w:t xml:space="preserve"> </w:t>
       </w:r>
-      <w:hyperlink r:id="rId13" w:anchor="the-different-styles-of-typography" w:history="1">
+      <w:hyperlink r:id="rId14" w:anchor="the-different-styles-of-typography" w:history="1">
         <w:r>
           <w:rPr>
             <w:rStyle w:val="Hyperlink"/>
@@ -1938,7 +2245,7 @@
         </w:rPr>
         <w:t xml:space="preserve">Adeyemicovenant3, n.d. Key Performance Indicators for Bakeries [CMS Project]. Scribd. Available at: </w:t>
       </w:r>
-      <w:hyperlink r:id="rId14" w:history="1">
+      <w:hyperlink r:id="rId15" w:history="1">
         <w:r>
           <w:rPr>
             <w:rStyle w:val="Hyperlink"/>
@@ -2011,7 +2318,7 @@
         </w:rPr>
         <w:t xml:space="preserve"> palette (Bakery Website): #880D1E, #DD2D4A, #F26A8D, #F49CBB, #CBEEF3. [image online] Available at: </w:t>
       </w:r>
-      <w:hyperlink r:id="rId15" w:history="1">
+      <w:hyperlink r:id="rId16" w:history="1">
         <w:r>
           <w:rPr>
             <w:rStyle w:val="Hyperlink"/>
@@ -2024,9 +2331,8 @@
         <w:rPr>
           <w:lang w:val="en-GB"/>
         </w:rPr>
-        <w:t xml:space="preserve">  </w:t>
-      </w:r>
-      <w:proofErr w:type="gramStart"/>
+        <w:t xml:space="preserve">   </w:t>
+      </w:r>
       <w:r>
         <w:rPr>
           <w:lang w:val="en-GB"/>
@@ -2043,20 +2349,7 @@
         <w:rPr>
           <w:lang w:val="en-GB"/>
         </w:rPr>
-        <w:t xml:space="preserve"> </w:t>
-      </w:r>
-      <w:r>
-        <w:rPr>
-          <w:lang w:val="en-GB"/>
-        </w:rPr>
-        <w:t>[</w:t>
-      </w:r>
-      <w:proofErr w:type="gramEnd"/>
-      <w:r>
-        <w:rPr>
-          <w:lang w:val="en-GB"/>
-        </w:rPr>
-        <w:t>Accessed 1 September 2026].</w:t>
+        <w:t>[Accessed 1 September 2026].</w:t>
       </w:r>
       <w:r>
         <w:rPr>
@@ -2093,7 +2386,7 @@
       <w:r>
         <w:t xml:space="preserve">. Available at: </w:t>
       </w:r>
-      <w:hyperlink r:id="rId16" w:history="1">
+      <w:hyperlink r:id="rId17" w:history="1">
         <w:r>
           <w:rPr>
             <w:rStyle w:val="Hyperlink"/>
@@ -2128,11 +2421,64 @@
           <w:lang w:val="en-GB"/>
         </w:rPr>
       </w:pPr>
+      <w:r>
+        <w:rPr>
+          <w:lang w:val="en-GB"/>
+        </w:rPr>
+        <w:t xml:space="preserve">MDN Web Docs, 2024. HTML </w:t>
+      </w:r>
       <w:proofErr w:type="spellStart"/>
       <w:r>
         <w:rPr>
           <w:lang w:val="en-GB"/>
         </w:rPr>
+        <w:t>cheatsheet</w:t>
+      </w:r>
+      <w:proofErr w:type="spellEnd"/>
+      <w:r>
+        <w:rPr>
+          <w:lang w:val="en-GB"/>
+        </w:rPr>
+        <w:t xml:space="preserve">. [online] Available at: </w:t>
+      </w:r>
+      <w:hyperlink r:id="rId18" w:history="1">
+        <w:r>
+          <w:rPr>
+            <w:rStyle w:val="Hyperlink"/>
+            <w:lang w:val="en-GB"/>
+          </w:rPr>
+          <w:t>https://developer.mozilla.org/en-US/docs/Web/HTML/Guides/Cheatsheet</w:t>
+        </w:r>
+      </w:hyperlink>
+      <w:r>
+        <w:rPr>
+          <w:lang w:val="en-GB"/>
+        </w:rPr>
+        <w:t xml:space="preserve"> </w:t>
+      </w:r>
+      <w:r>
+        <w:rPr>
+          <w:lang w:val="en-GB"/>
+        </w:rPr>
+        <w:t xml:space="preserve"> [Accessed 1 September 2026].</w:t>
+      </w:r>
+    </w:p>
+    <w:p>
+      <w:pPr>
+        <w:pStyle w:val="ListParagraph"/>
+        <w:numPr>
+          <w:ilvl w:val="0"/>
+          <w:numId w:val="2"/>
+        </w:numPr>
+        <w:rPr>
+          <w:lang w:val="en-GB"/>
+        </w:rPr>
+      </w:pPr>
+      <w:proofErr w:type="spellStart"/>
+      <w:r>
+        <w:rPr>
+          <w:lang w:val="en-GB"/>
+        </w:rPr>
         <w:t>Zeely</w:t>
       </w:r>
       <w:proofErr w:type="spellEnd"/>
@@ -2156,7 +2502,7 @@
         </w:rPr>
         <w:t xml:space="preserve"> AI, 24 September. Available at: </w:t>
       </w:r>
-      <w:hyperlink r:id="rId17" w:history="1">
+      <w:hyperlink r:id="rId19" w:history="1">
         <w:r>
           <w:rPr>
             <w:rStyle w:val="Hyperlink"/>
@@ -3396,7 +3742,6 @@
   <w:style w:type="character" w:default="1" w:styleId="DefaultParagraphFont">
     <w:name w:val="Default Paragraph Font"/>
     <w:uiPriority w:val="1"/>
-    <w:semiHidden/>
     <w:unhideWhenUsed/>
   </w:style>
   <w:style w:type="table" w:default="1" w:styleId="TableNormal">

</xml_diff>

<commit_message>
Update cover page in documentation with module details and GitHub link
</commit_message>
<xml_diff>
--- a/Documentation/WEDE5020 PoE Part 1 (SweetyPie).docx
+++ b/Documentation/WEDE5020 PoE Part 1 (SweetyPie).docx
@@ -13,7 +13,100 @@
         <w:rPr>
           <w:lang w:val="en-GB"/>
         </w:rPr>
-        <w:t>WEDE5020 PoE - Planning (Second website)</w:t>
+        <w:t>COVER PAGE.</w:t>
+      </w:r>
+    </w:p>
+    <w:p>
+      <w:pPr>
+        <w:pStyle w:val="Heading1"/>
+        <w:rPr>
+          <w:lang w:val="en-GB"/>
+        </w:rPr>
+      </w:pPr>
+      <w:r>
+        <w:rPr>
+          <w:lang w:val="en-GB"/>
+        </w:rPr>
+        <w:t>Module: Web Development Introduction WEDE5020.</w:t>
+      </w:r>
+    </w:p>
+    <w:p>
+      <w:pPr>
+        <w:pStyle w:val="Heading1"/>
+        <w:rPr>
+          <w:lang w:val="en-GB"/>
+        </w:rPr>
+      </w:pPr>
+      <w:r>
+        <w:rPr>
+          <w:lang w:val="en-GB"/>
+        </w:rPr>
+        <w:t>Full name: Armand Schutte Rieck.</w:t>
+      </w:r>
+    </w:p>
+    <w:p>
+      <w:pPr>
+        <w:pStyle w:val="Heading1"/>
+        <w:rPr>
+          <w:lang w:val="en-GB"/>
+        </w:rPr>
+      </w:pPr>
+      <w:r>
+        <w:rPr>
+          <w:lang w:val="en-GB"/>
+        </w:rPr>
+        <w:t>Student Number: ST10507392</w:t>
+      </w:r>
+    </w:p>
+    <w:p>
+      <w:pPr>
+        <w:rPr>
+          <w:lang w:val="en-GB"/>
+        </w:rPr>
+      </w:pPr>
+    </w:p>
+    <w:p>
+      <w:pPr>
+        <w:rPr>
+          <w:b/>
+          <w:bCs/>
+          <w:lang w:val="en-GB"/>
+        </w:rPr>
+      </w:pPr>
+      <w:r>
+        <w:rPr>
+          <w:b/>
+          <w:bCs/>
+          <w:lang w:val="en-GB"/>
+        </w:rPr>
+        <w:t>GitHub</w:t>
+      </w:r>
+      <w:r>
+        <w:rPr>
+          <w:b/>
+          <w:bCs/>
+          <w:lang w:val="en-GB"/>
+        </w:rPr>
+        <w:t xml:space="preserve"> Link: </w:t>
+      </w:r>
+      <w:hyperlink r:id="rId5" w:history="1">
+        <w:r>
+          <w:rPr>
+            <w:rStyle w:val="Hyperlink"/>
+            <w:b/>
+            <w:bCs/>
+            <w:lang w:val="en-GB"/>
+          </w:rPr>
+          <w:t>https://github.com/MrRobot-Hack6/WEDE5020-Bakery-SweetyPies</w:t>
+        </w:r>
+      </w:hyperlink>
+      <w:r>
+        <w:rPr>
+          <w:b/>
+          <w:bCs/>
+          <w:lang w:val="en-GB"/>
+        </w:rPr>
+        <w:t xml:space="preserve"> </w:t>
       </w:r>
     </w:p>
     <w:p>
@@ -141,7 +234,19 @@
         <w:rPr>
           <w:lang w:val="en-GB"/>
         </w:rPr>
-        <w:t xml:space="preserve">Started as a small bakery, creating the most delicious treats for a small community; now they want to expand their territory into </w:t>
+        <w:t>Started as a small bakery</w:t>
+      </w:r>
+      <w:r>
+        <w:rPr>
+          <w:lang w:val="en-GB"/>
+        </w:rPr>
+        <w:t xml:space="preserve"> creating delicious treats for a small community; now they want to expand </w:t>
+      </w:r>
+      <w:r>
+        <w:rPr>
+          <w:lang w:val="en-GB"/>
+        </w:rPr>
+        <w:t xml:space="preserve">into </w:t>
       </w:r>
       <w:r>
         <w:rPr>
@@ -472,6 +577,7 @@
         <w:rPr>
           <w:lang w:val="en-GB"/>
         </w:rPr>
+        <w:lastRenderedPageBreak/>
         <w:t xml:space="preserve">Proposed website </w:t>
       </w:r>
       <w:r>
@@ -639,7 +745,6 @@
           <w:bCs/>
           <w:lang w:val="en-GB"/>
         </w:rPr>
-        <w:lastRenderedPageBreak/>
         <w:t>Contact Us</w:t>
       </w:r>
       <w:r>
@@ -806,7 +911,7 @@
                     <pic:cNvPicPr/>
                   </pic:nvPicPr>
                   <pic:blipFill>
-                    <a:blip r:embed="rId5" cstate="print">
+                    <a:blip r:embed="rId6" cstate="print">
                       <a:extLst>
                         <a:ext uri="{28A0092B-C50C-407E-A947-70E740481C1C}">
                           <a14:useLocalDpi xmlns:a14="http://schemas.microsoft.com/office/drawing/2010/main" val="0"/>
@@ -981,6 +1086,7 @@
           <w:bCs/>
           <w:lang w:val="en-GB"/>
         </w:rPr>
+        <w:lastRenderedPageBreak/>
         <w:t>Layout and Design:</w:t>
       </w:r>
     </w:p>
@@ -1105,14 +1211,7 @@
         <w:rPr>
           <w:lang w:val="en-GB"/>
         </w:rPr>
-        <w:t xml:space="preserve">There </w:t>
-      </w:r>
-      <w:r>
-        <w:rPr>
-          <w:lang w:val="en-GB"/>
-        </w:rPr>
-        <w:lastRenderedPageBreak/>
-        <w:t xml:space="preserve">will be a forum </w:t>
+        <w:t xml:space="preserve">There will be a forum </w:t>
       </w:r>
       <w:r>
         <w:rPr>
@@ -1271,7 +1370,7 @@
                     <pic:cNvPicPr/>
                   </pic:nvPicPr>
                   <pic:blipFill>
-                    <a:blip r:embed="rId6">
+                    <a:blip r:embed="rId7">
                       <a:extLst>
                         <a:ext uri="{28A0092B-C50C-407E-A947-70E740481C1C}">
                           <a14:useLocalDpi xmlns:a14="http://schemas.microsoft.com/office/drawing/2010/main" val="0"/>
@@ -1342,6 +1441,7 @@
           <w:noProof/>
           <w:lang w:val="en-GB"/>
         </w:rPr>
+        <w:lastRenderedPageBreak/>
         <w:drawing>
           <wp:inline distT="0" distB="0" distL="0" distR="0" wp14:anchorId="7BABBD28" wp14:editId="1DBB548C">
             <wp:extent cx="4762500" cy="3264535"/>
@@ -1358,7 +1458,7 @@
                     <pic:cNvPicPr/>
                   </pic:nvPicPr>
                   <pic:blipFill>
-                    <a:blip r:embed="rId7">
+                    <a:blip r:embed="rId8">
                       <a:extLst>
                         <a:ext uri="{28A0092B-C50C-407E-A947-70E740481C1C}">
                           <a14:useLocalDpi xmlns:a14="http://schemas.microsoft.com/office/drawing/2010/main" val="0"/>
@@ -1420,7 +1520,6 @@
           <w:bCs/>
           <w:lang w:val="en-GB"/>
         </w:rPr>
-        <w:lastRenderedPageBreak/>
         <w:t xml:space="preserve">Contact Us: </w:t>
       </w:r>
     </w:p>
@@ -1456,7 +1555,7 @@
                     <pic:cNvPicPr/>
                   </pic:nvPicPr>
                   <pic:blipFill>
-                    <a:blip r:embed="rId8">
+                    <a:blip r:embed="rId9">
                       <a:extLst>
                         <a:ext uri="{28A0092B-C50C-407E-A947-70E740481C1C}">
                           <a14:useLocalDpi xmlns:a14="http://schemas.microsoft.com/office/drawing/2010/main" val="0"/>
@@ -1534,6 +1633,7 @@
         <w:rPr>
           <w:noProof/>
         </w:rPr>
+        <w:lastRenderedPageBreak/>
         <w:drawing>
           <wp:inline distT="0" distB="0" distL="0" distR="0" wp14:anchorId="5712DF35" wp14:editId="1AF1EA9D">
             <wp:extent cx="5731510" cy="3223895"/>
@@ -1550,7 +1650,7 @@
                     <pic:cNvPicPr/>
                   </pic:nvPicPr>
                   <pic:blipFill>
-                    <a:blip r:embed="rId9"/>
+                    <a:blip r:embed="rId10"/>
                     <a:stretch>
                       <a:fillRect/>
                     </a:stretch>
@@ -1785,6 +1885,7 @@
           <w:noProof/>
           <w:lang w:val="en-GB"/>
         </w:rPr>
+        <w:lastRenderedPageBreak/>
         <w:drawing>
           <wp:inline distT="0" distB="0" distL="0" distR="0" wp14:anchorId="74E420AB" wp14:editId="6443CAC9">
             <wp:extent cx="4175760" cy="3766326"/>
@@ -1801,7 +1902,7 @@
                     <pic:cNvPicPr/>
                   </pic:nvPicPr>
                   <pic:blipFill>
-                    <a:blip r:embed="rId10">
+                    <a:blip r:embed="rId11">
                       <a:extLst>
                         <a:ext uri="{28A0092B-C50C-407E-A947-70E740481C1C}">
                           <a14:useLocalDpi xmlns:a14="http://schemas.microsoft.com/office/drawing/2010/main" val="0"/>
@@ -1896,7 +1997,7 @@
         </w:rPr>
         <w:t xml:space="preserve"> Link: </w:t>
       </w:r>
-      <w:hyperlink r:id="rId11" w:history="1">
+      <w:hyperlink r:id="rId12" w:history="1">
         <w:r>
           <w:rPr>
             <w:rStyle w:val="Hyperlink"/>
@@ -1932,7 +2033,7 @@
         </w:rPr>
         <w:t xml:space="preserve"> – </w:t>
       </w:r>
-      <w:hyperlink r:id="rId12" w:history="1">
+      <w:hyperlink r:id="rId13" w:history="1">
         <w:r>
           <w:rPr>
             <w:rStyle w:val="Hyperlink"/>
@@ -1953,7 +2054,7 @@
         </w:rPr>
         <w:t xml:space="preserve">Link: </w:t>
       </w:r>
-      <w:hyperlink r:id="rId13" w:history="1">
+      <w:hyperlink r:id="rId14" w:history="1">
         <w:r>
           <w:rPr>
             <w:rStyle w:val="Hyperlink"/>
@@ -1987,7 +2088,6 @@
           <w:bCs/>
           <w:lang w:val="en-GB"/>
         </w:rPr>
-        <w:lastRenderedPageBreak/>
         <w:t>Programming language</w:t>
       </w:r>
       <w:r>
@@ -2198,6 +2298,7 @@
         <w:rPr>
           <w:lang w:val="en-GB"/>
         </w:rPr>
+        <w:lastRenderedPageBreak/>
         <w:t>Adobe, n.d. The different styles of typography. Adobe Creative Cloud. Available at:</w:t>
       </w:r>
       <w:r>
@@ -2206,7 +2307,7 @@
         </w:rPr>
         <w:t xml:space="preserve"> </w:t>
       </w:r>
-      <w:hyperlink r:id="rId14" w:anchor="the-different-styles-of-typography" w:history="1">
+      <w:hyperlink r:id="rId15" w:anchor="the-different-styles-of-typography" w:history="1">
         <w:r>
           <w:rPr>
             <w:rStyle w:val="Hyperlink"/>
@@ -2245,7 +2346,7 @@
         </w:rPr>
         <w:t xml:space="preserve">Adeyemicovenant3, n.d. Key Performance Indicators for Bakeries [CMS Project]. Scribd. Available at: </w:t>
       </w:r>
-      <w:hyperlink r:id="rId15" w:history="1">
+      <w:hyperlink r:id="rId16" w:history="1">
         <w:r>
           <w:rPr>
             <w:rStyle w:val="Hyperlink"/>
@@ -2318,7 +2419,7 @@
         </w:rPr>
         <w:t xml:space="preserve"> palette (Bakery Website): #880D1E, #DD2D4A, #F26A8D, #F49CBB, #CBEEF3. [image online] Available at: </w:t>
       </w:r>
-      <w:hyperlink r:id="rId16" w:history="1">
+      <w:hyperlink r:id="rId17" w:history="1">
         <w:r>
           <w:rPr>
             <w:rStyle w:val="Hyperlink"/>
@@ -2386,7 +2487,7 @@
       <w:r>
         <w:t xml:space="preserve">. Available at: </w:t>
       </w:r>
-      <w:hyperlink r:id="rId17" w:history="1">
+      <w:hyperlink r:id="rId18" w:history="1">
         <w:r>
           <w:rPr>
             <w:rStyle w:val="Hyperlink"/>
@@ -2441,7 +2542,7 @@
         </w:rPr>
         <w:t xml:space="preserve">. [online] Available at: </w:t>
       </w:r>
-      <w:hyperlink r:id="rId18" w:history="1">
+      <w:hyperlink r:id="rId19" w:history="1">
         <w:r>
           <w:rPr>
             <w:rStyle w:val="Hyperlink"/>
@@ -2502,7 +2603,7 @@
         </w:rPr>
         <w:t xml:space="preserve"> AI, 24 September. Available at: </w:t>
       </w:r>
-      <w:hyperlink r:id="rId19" w:history="1">
+      <w:hyperlink r:id="rId20" w:history="1">
         <w:r>
           <w:rPr>
             <w:rStyle w:val="Hyperlink"/>
@@ -3742,6 +3843,7 @@
   <w:style w:type="character" w:default="1" w:styleId="DefaultParagraphFont">
     <w:name w:val="Default Paragraph Font"/>
     <w:uiPriority w:val="1"/>
+    <w:semiHidden/>
     <w:unhideWhenUsed/>
   </w:style>
   <w:style w:type="table" w:default="1" w:styleId="TableNormal">

</xml_diff>